<commit_message>
Fix FR.218 templates: remove w:ind from CB_PLANNER cell
The <w:ind w:left=...> element in the [SIG:CB_PLANNER] paragraph of
backend/uaf_blank_set FR.218 templates was causing LibreOffice to emit
the tag as split PDF text objects ([SIG:CB_] + [PLANNER]), which broke
pdfplumber regex detection. Removed w:ind from that paragraph only in:
- uaf_blank_set/9-14-45-22-5001 FR.218
- uaf_blank_set/13485 FR.218
- uaf_blank_set/27001 FR.218
</commit_message>
<xml_diff>
--- a/backend/uaf_blank_set/13485/Initial Certification /Stage 1/FR.218_Application_Review_Form_R8&09.10.2025.docx
+++ b/backend/uaf_blank_set/13485/Initial Certification /Stage 1/FR.218_Application_Review_Form_R8&09.10.2025.docx
@@ -37,7 +37,6 @@
           <w:p>
             <w:pPr>
               <w:pStyle w:val="TableParagraph"/>
-              <w:ind w:left="30"/>
               <w:rPr>
                 <w:sz w:val="16"/>
                 <w:szCs w:val="16"/>
@@ -63,7 +62,6 @@
           <w:p>
             <w:pPr>
               <w:pStyle w:val="TableParagraph"/>
-              <w:ind w:left="41"/>
               <w:rPr>
                 <w:sz w:val="16"/>
                 <w:szCs w:val="16"/>
@@ -107,7 +105,6 @@
           <w:p>
             <w:pPr>
               <w:pStyle w:val="TableParagraph"/>
-              <w:ind w:left="30"/>
               <w:rPr>
                 <w:sz w:val="16"/>
                 <w:szCs w:val="16"/>
@@ -133,7 +130,6 @@
           <w:p>
             <w:pPr>
               <w:pStyle w:val="TableParagraph"/>
-              <w:ind w:left="41"/>
               <w:rPr>
                 <w:sz w:val="16"/>
                 <w:szCs w:val="16"/>
@@ -184,7 +180,6 @@
           <w:p>
             <w:pPr>
               <w:pStyle w:val="TableParagraph"/>
-              <w:ind w:left="30"/>
               <w:rPr>
                 <w:sz w:val="16"/>
                 <w:szCs w:val="16"/>
@@ -210,7 +205,6 @@
           <w:p>
             <w:pPr>
               <w:pStyle w:val="TableParagraph"/>
-              <w:ind w:left="41"/>
               <w:rPr>
                 <w:sz w:val="16"/>
                 <w:szCs w:val="16"/>
@@ -261,7 +255,6 @@
           <w:p>
             <w:pPr>
               <w:pStyle w:val="TableParagraph"/>
-              <w:ind w:left="30"/>
               <w:rPr>
                 <w:sz w:val="16"/>
                 <w:szCs w:val="16"/>
@@ -287,7 +280,6 @@
           <w:p>
             <w:pPr>
               <w:pStyle w:val="TableParagraph"/>
-              <w:ind w:left="41"/>
               <w:rPr>
                 <w:sz w:val="16"/>
                 <w:szCs w:val="16"/>
@@ -338,7 +330,6 @@
           <w:p>
             <w:pPr>
               <w:pStyle w:val="TableParagraph"/>
-              <w:ind w:left="62" w:right="57"/>
               <w:rPr>
                 <w:sz w:val="16"/>
                 <w:szCs w:val="16"/>
@@ -363,7 +354,6 @@
           <w:p>
             <w:pPr>
               <w:pStyle w:val="TableParagraph"/>
-              <w:ind w:left="62" w:right="57"/>
               <w:rPr>
                 <w:sz w:val="16"/>
                 <w:szCs w:val="16"/>
@@ -381,7 +371,6 @@
           <w:p>
             <w:pPr>
               <w:pStyle w:val="TableParagraph"/>
-              <w:ind w:left="62" w:right="57"/>
               <w:rPr>
                 <w:sz w:val="16"/>
                 <w:szCs w:val="16"/>
@@ -406,7 +395,6 @@
           <w:p>
             <w:pPr>
               <w:pStyle w:val="TableParagraph"/>
-              <w:ind w:left="62" w:right="57"/>
               <w:rPr>
                 <w:sz w:val="16"/>
                 <w:szCs w:val="16"/>
@@ -429,7 +417,6 @@
           <w:p>
             <w:pPr>
               <w:pStyle w:val="TableParagraph"/>
-              <w:ind w:left="62" w:right="57"/>
               <w:rPr>
                 <w:sz w:val="16"/>
                 <w:szCs w:val="16"/>
@@ -455,7 +442,6 @@
           <w:p>
             <w:pPr>
               <w:pStyle w:val="TableParagraph"/>
-              <w:ind w:left="62" w:right="57"/>
               <w:rPr>
                 <w:sz w:val="16"/>
                 <w:szCs w:val="16"/>
@@ -655,7 +641,6 @@
           </w:tcPr>
           <w:p>
             <w:pPr>
-              <w:ind w:left="-24"/>
               <w:rPr>
                 <w:bCs/>
                 <w:sz w:val="16"/>
@@ -681,7 +666,6 @@
           </w:tcPr>
           <w:p>
             <w:pPr>
-              <w:ind w:left="-48" w:right="-84"/>
               <w:rPr>
                 <w:bCs/>
                 <w:sz w:val="16"/>
@@ -728,7 +712,6 @@
           </w:tcPr>
           <w:p>
             <w:pPr>
-              <w:ind w:left="-24" w:right="-77"/>
               <w:rPr>
                 <w:sz w:val="16"/>
                 <w:szCs w:val="16"/>
@@ -752,7 +735,6 @@
           </w:tcPr>
           <w:p>
             <w:pPr>
-              <w:ind w:left="-81" w:right="-68"/>
               <w:rPr>
                 <w:bCs/>
                 <w:sz w:val="16"/>
@@ -811,7 +793,6 @@
           </w:tcPr>
           <w:p>
             <w:pPr>
-              <w:ind w:left="-24" w:right="-77"/>
               <w:rPr>
                 <w:sz w:val="16"/>
                 <w:szCs w:val="16"/>
@@ -835,7 +816,6 @@
           </w:tcPr>
           <w:p>
             <w:pPr>
-              <w:ind w:left="-48" w:right="-84"/>
               <w:rPr>
                 <w:bCs/>
                 <w:sz w:val="16"/>
@@ -907,7 +887,6 @@
           </w:tcPr>
           <w:p>
             <w:pPr>
-              <w:ind w:left="-81" w:right="-68"/>
               <w:rPr>
                 <w:bCs/>
                 <w:sz w:val="16"/>
@@ -958,7 +937,6 @@
           </w:tcPr>
           <w:p>
             <w:pPr>
-              <w:ind w:left="-24" w:right="-77"/>
               <w:rPr>
                 <w:sz w:val="16"/>
                 <w:szCs w:val="16"/>
@@ -982,7 +960,6 @@
           </w:tcPr>
           <w:p>
             <w:pPr>
-              <w:ind w:left="-48" w:right="-84"/>
               <w:rPr>
                 <w:bCs/>
                 <w:sz w:val="16"/>
@@ -1127,7 +1104,6 @@
           </w:tcPr>
           <w:p>
             <w:pPr>
-              <w:ind w:left="-24" w:right="-77"/>
               <w:rPr>
                 <w:sz w:val="16"/>
                 <w:szCs w:val="16"/>
@@ -1143,7 +1119,6 @@
           </w:tcPr>
           <w:p>
             <w:pPr>
-              <w:ind w:left="-81" w:right="-68"/>
               <w:rPr>
                 <w:bCs/>
                 <w:sz w:val="16"/>
@@ -1166,7 +1141,6 @@
           </w:tcPr>
           <w:p>
             <w:pPr>
-              <w:ind w:left="-24" w:right="-77"/>
               <w:rPr>
                 <w:sz w:val="16"/>
                 <w:szCs w:val="16"/>
@@ -1191,7 +1165,6 @@
           </w:tcPr>
           <w:p>
             <w:pPr>
-              <w:ind w:left="-48" w:right="-84"/>
               <w:rPr>
                 <w:bCs/>
                 <w:sz w:val="16"/>
@@ -1235,7 +1208,6 @@
           </w:tcPr>
           <w:p>
             <w:pPr>
-              <w:ind w:right="-77"/>
               <w:rPr>
                 <w:bCs/>
                 <w:sz w:val="16"/>
@@ -1267,7 +1239,6 @@
           </w:tcPr>
           <w:p>
             <w:pPr>
-              <w:ind w:right="-77"/>
               <w:rPr>
                 <w:bCs/>
                 <w:sz w:val="16"/>
@@ -1311,7 +1282,6 @@
           </w:tcPr>
           <w:p>
             <w:pPr>
-              <w:ind w:right="-77"/>
               <w:rPr>
                 <w:bCs/>
                 <w:sz w:val="16"/>
@@ -1343,7 +1313,6 @@
           </w:tcPr>
           <w:p>
             <w:pPr>
-              <w:ind w:right="-77"/>
               <w:rPr>
                 <w:bCs/>
                 <w:sz w:val="16"/>
@@ -1387,7 +1356,6 @@
           </w:tcPr>
           <w:p>
             <w:pPr>
-              <w:ind w:left="-81" w:right="-68"/>
               <w:rPr>
                 <w:bCs/>
                 <w:sz w:val="16"/>
@@ -1424,7 +1392,6 @@
           </w:tcPr>
           <w:p>
             <w:pPr>
-              <w:ind w:left="-24" w:right="-77"/>
               <w:rPr>
                 <w:sz w:val="16"/>
                 <w:szCs w:val="16"/>
@@ -1449,7 +1416,6 @@
           </w:tcPr>
           <w:p>
             <w:pPr>
-              <w:ind w:left="-48" w:right="-84"/>
               <w:rPr>
                 <w:bCs/>
                 <w:sz w:val="16"/>
@@ -1475,7 +1441,6 @@
           </w:tcPr>
           <w:p>
             <w:pPr>
-              <w:ind w:right="-77"/>
               <w:rPr>
                 <w:bCs/>
                 <w:sz w:val="16"/>
@@ -1493,7 +1458,6 @@
           </w:tcPr>
           <w:p>
             <w:pPr>
-              <w:ind w:right="-77"/>
               <w:rPr>
                 <w:bCs/>
                 <w:sz w:val="16"/>
@@ -1519,7 +1483,6 @@
           </w:tcPr>
           <w:p>
             <w:pPr>
-              <w:ind w:right="-77"/>
               <w:rPr>
                 <w:bCs/>
                 <w:sz w:val="16"/>
@@ -1537,7 +1500,6 @@
           </w:tcPr>
           <w:p>
             <w:pPr>
-              <w:ind w:right="-77"/>
               <w:rPr>
                 <w:bCs/>
                 <w:sz w:val="16"/>
@@ -1563,7 +1525,6 @@
           </w:tcPr>
           <w:p>
             <w:pPr>
-              <w:ind w:left="-81" w:right="-68"/>
               <w:rPr>
                 <w:bCs/>
                 <w:sz w:val="16"/>
@@ -1586,7 +1547,6 @@
           </w:tcPr>
           <w:p>
             <w:pPr>
-              <w:ind w:left="-24" w:right="-77"/>
               <w:rPr>
                 <w:sz w:val="16"/>
                 <w:szCs w:val="16"/>
@@ -1610,7 +1570,6 @@
           </w:tcPr>
           <w:p>
             <w:pPr>
-              <w:ind w:left="-48" w:right="-84"/>
               <w:rPr>
                 <w:bCs/>
                 <w:sz w:val="16"/>
@@ -1657,7 +1616,6 @@
           </w:tcPr>
           <w:p>
             <w:pPr>
-              <w:ind w:left="-24" w:right="-77"/>
               <w:rPr>
                 <w:sz w:val="16"/>
                 <w:szCs w:val="16"/>
@@ -1681,7 +1639,6 @@
           </w:tcPr>
           <w:p>
             <w:pPr>
-              <w:ind w:left="-81" w:right="-68"/>
               <w:rPr>
                 <w:bCs/>
                 <w:sz w:val="16"/>
@@ -1732,7 +1689,6 @@
           </w:tcPr>
           <w:p>
             <w:pPr>
-              <w:ind w:left="-24" w:right="-77"/>
               <w:rPr>
                 <w:sz w:val="16"/>
                 <w:szCs w:val="16"/>
@@ -1756,7 +1712,6 @@
           </w:tcPr>
           <w:p>
             <w:pPr>
-              <w:ind w:left="-48" w:right="-84"/>
               <w:rPr>
                 <w:bCs/>
                 <w:sz w:val="16"/>
@@ -1803,7 +1758,6 @@
           </w:tcPr>
           <w:p>
             <w:pPr>
-              <w:ind w:left="-24" w:right="-77"/>
               <w:rPr>
                 <w:sz w:val="16"/>
                 <w:szCs w:val="16"/>
@@ -1827,7 +1781,6 @@
           </w:tcPr>
           <w:p>
             <w:pPr>
-              <w:ind w:left="-81" w:right="-68"/>
               <w:rPr>
                 <w:bCs/>
                 <w:sz w:val="16"/>
@@ -1909,7 +1862,6 @@
           </w:tcPr>
           <w:p>
             <w:pPr>
-              <w:ind w:right="58"/>
               <w:rPr>
                 <w:bCs/>
                 <w:sz w:val="16"/>
@@ -1935,7 +1887,6 @@
           </w:tcPr>
           <w:p>
             <w:pPr>
-              <w:ind w:right="58"/>
               <w:rPr>
                 <w:bCs/>
                 <w:sz w:val="16"/>
@@ -1962,7 +1913,6 @@
           </w:tcPr>
           <w:p>
             <w:pPr>
-              <w:ind w:right="58"/>
               <w:rPr>
                 <w:bCs/>
                 <w:sz w:val="16"/>
@@ -1988,7 +1938,6 @@
           </w:tcPr>
           <w:p>
             <w:pPr>
-              <w:ind w:right="58"/>
               <w:rPr>
                 <w:bCs/>
                 <w:sz w:val="16"/>
@@ -2020,7 +1969,6 @@
           </w:tcPr>
           <w:p>
             <w:pPr>
-              <w:ind w:right="58"/>
               <w:rPr>
                 <w:bCs/>
                 <w:sz w:val="16"/>
@@ -2080,7 +2028,6 @@
           </w:tcPr>
           <w:p>
             <w:pPr>
-              <w:ind w:right="58"/>
               <w:rPr>
                 <w:bCs/>
                 <w:sz w:val="16"/>
@@ -2098,7 +2045,6 @@
           </w:tcPr>
           <w:p>
             <w:pPr>
-              <w:ind w:right="58"/>
               <w:rPr>
                 <w:bCs/>
                 <w:sz w:val="16"/>
@@ -2163,7 +2109,6 @@
           </w:tcPr>
           <w:p>
             <w:pPr>
-              <w:ind w:right="58"/>
               <w:rPr>
                 <w:bCs/>
                 <w:sz w:val="16"/>
@@ -2507,7 +2452,6 @@
           <w:p>
             <w:pPr>
               <w:pStyle w:val="TableParagraph"/>
-              <w:ind w:right="127"/>
               <w:rPr>
                 <w:sz w:val="16"/>
                 <w:szCs w:val="16"/>
@@ -2589,7 +2533,6 @@
           <w:p>
             <w:pPr>
               <w:pStyle w:val="TableParagraph"/>
-              <w:ind w:left="228"/>
               <w:jc w:val="center"/>
               <w:rPr>
                 <w:sz w:val="16"/>
@@ -2624,7 +2567,6 @@
           <w:p>
             <w:pPr>
               <w:pStyle w:val="TableParagraph"/>
-              <w:ind w:left="386"/>
               <w:jc w:val="center"/>
               <w:rPr>
                 <w:sz w:val="16"/>
@@ -2651,7 +2593,6 @@
           <w:p>
             <w:pPr>
               <w:pStyle w:val="TableParagraph"/>
-              <w:ind w:left="124"/>
               <w:jc w:val="center"/>
               <w:rPr>
                 <w:sz w:val="16"/>
@@ -2898,7 +2839,6 @@
                 <w:ilvl w:val="0"/>
                 <w:numId w:val="4"/>
               </w:numPr>
-              <w:ind w:left="360"/>
               <w:jc w:val="right"/>
               <w:rPr>
                 <w:sz w:val="16"/>
@@ -2915,7 +2855,6 @@
           </w:tcPr>
           <w:p>
             <w:pPr>
-              <w:ind w:left="62" w:right="58"/>
               <w:rPr>
                 <w:sz w:val="16"/>
                 <w:szCs w:val="16"/>
@@ -2939,7 +2878,6 @@
           </w:tcPr>
           <w:p>
             <w:pPr>
-              <w:ind w:left="62" w:right="58"/>
               <w:rPr>
                 <w:sz w:val="16"/>
                 <w:szCs w:val="16"/>
@@ -3053,7 +2991,6 @@
                 <w:ilvl w:val="0"/>
                 <w:numId w:val="4"/>
               </w:numPr>
-              <w:ind w:left="360"/>
               <w:jc w:val="right"/>
               <w:rPr>
                 <w:sz w:val="16"/>
@@ -3070,7 +3007,6 @@
           </w:tcPr>
           <w:p>
             <w:pPr>
-              <w:ind w:left="62" w:right="58"/>
               <w:rPr>
                 <w:sz w:val="16"/>
                 <w:szCs w:val="16"/>
@@ -3094,7 +3030,6 @@
           </w:tcPr>
           <w:p>
             <w:pPr>
-              <w:ind w:left="62" w:right="58"/>
               <w:rPr>
                 <w:sz w:val="16"/>
                 <w:szCs w:val="16"/>
@@ -3191,7 +3126,6 @@
                 <w:ilvl w:val="0"/>
                 <w:numId w:val="4"/>
               </w:numPr>
-              <w:ind w:left="360"/>
               <w:jc w:val="right"/>
               <w:rPr>
                 <w:sz w:val="16"/>
@@ -3208,7 +3142,6 @@
           </w:tcPr>
           <w:p>
             <w:pPr>
-              <w:ind w:left="62" w:right="58"/>
               <w:rPr>
                 <w:sz w:val="16"/>
                 <w:szCs w:val="16"/>
@@ -3232,7 +3165,6 @@
           </w:tcPr>
           <w:p>
             <w:pPr>
-              <w:ind w:left="62" w:right="58"/>
               <w:rPr>
                 <w:sz w:val="16"/>
                 <w:szCs w:val="16"/>
@@ -3329,7 +3261,6 @@
                 <w:ilvl w:val="0"/>
                 <w:numId w:val="4"/>
               </w:numPr>
-              <w:ind w:left="360"/>
               <w:jc w:val="right"/>
               <w:rPr>
                 <w:sz w:val="16"/>
@@ -3347,7 +3278,6 @@
           <w:p>
             <w:pPr>
               <w:pStyle w:val="TableParagraph"/>
-              <w:ind w:left="30"/>
               <w:rPr>
                 <w:sz w:val="16"/>
                 <w:szCs w:val="16"/>
@@ -3373,7 +3303,6 @@
           </w:p>
           <w:p>
             <w:pPr>
-              <w:ind w:left="62" w:right="58"/>
               <w:rPr>
                 <w:sz w:val="16"/>
                 <w:szCs w:val="16"/>
@@ -3397,7 +3326,6 @@
           </w:tcPr>
           <w:p>
             <w:pPr>
-              <w:ind w:left="62" w:right="58"/>
               <w:rPr>
                 <w:sz w:val="16"/>
                 <w:szCs w:val="16"/>
@@ -3494,7 +3422,6 @@
                 <w:ilvl w:val="0"/>
                 <w:numId w:val="4"/>
               </w:numPr>
-              <w:ind w:left="360"/>
               <w:jc w:val="right"/>
               <w:rPr>
                 <w:sz w:val="16"/>
@@ -3512,7 +3439,6 @@
           <w:p>
             <w:pPr>
               <w:pStyle w:val="TableParagraph"/>
-              <w:ind w:left="30"/>
               <w:rPr>
                 <w:sz w:val="16"/>
                 <w:szCs w:val="16"/>
@@ -3536,7 +3462,6 @@
           </w:tcPr>
           <w:p>
             <w:pPr>
-              <w:ind w:left="62" w:right="58"/>
               <w:rPr>
                 <w:sz w:val="16"/>
                 <w:szCs w:val="16"/>
@@ -3633,7 +3558,6 @@
                 <w:ilvl w:val="0"/>
                 <w:numId w:val="4"/>
               </w:numPr>
-              <w:ind w:left="360"/>
               <w:jc w:val="right"/>
               <w:rPr>
                 <w:sz w:val="16"/>
@@ -3651,7 +3575,6 @@
           <w:p>
             <w:pPr>
               <w:pStyle w:val="TableParagraph"/>
-              <w:ind w:left="30"/>
               <w:rPr>
                 <w:sz w:val="16"/>
                 <w:szCs w:val="16"/>
@@ -3675,7 +3598,6 @@
           </w:tcPr>
           <w:p>
             <w:pPr>
-              <w:ind w:left="62" w:right="58"/>
               <w:rPr>
                 <w:sz w:val="16"/>
                 <w:szCs w:val="16"/>
@@ -3853,7 +3775,6 @@
                 <w:ilvl w:val="0"/>
                 <w:numId w:val="5"/>
               </w:numPr>
-              <w:ind w:left="0"/>
               <w:jc w:val="right"/>
               <w:rPr>
                 <w:sz w:val="16"/>
@@ -3870,7 +3791,6 @@
           </w:tcPr>
           <w:p>
             <w:pPr>
-              <w:ind w:left="62" w:right="58"/>
               <w:rPr>
                 <w:sz w:val="16"/>
                 <w:szCs w:val="16"/>
@@ -3894,7 +3814,6 @@
           </w:tcPr>
           <w:p>
             <w:pPr>
-              <w:ind w:left="62" w:right="58"/>
               <w:rPr>
                 <w:sz w:val="16"/>
                 <w:szCs w:val="16"/>
@@ -3991,7 +3910,6 @@
                 <w:ilvl w:val="0"/>
                 <w:numId w:val="5"/>
               </w:numPr>
-              <w:ind w:left="0"/>
               <w:jc w:val="right"/>
               <w:rPr>
                 <w:sz w:val="16"/>
@@ -4008,7 +3926,6 @@
           </w:tcPr>
           <w:p>
             <w:pPr>
-              <w:ind w:left="62" w:right="58"/>
               <w:rPr>
                 <w:sz w:val="16"/>
                 <w:szCs w:val="16"/>
@@ -4032,7 +3949,6 @@
           </w:tcPr>
           <w:p>
             <w:pPr>
-              <w:ind w:left="62" w:right="58"/>
               <w:rPr>
                 <w:sz w:val="16"/>
                 <w:szCs w:val="16"/>
@@ -4129,7 +4045,6 @@
                 <w:ilvl w:val="0"/>
                 <w:numId w:val="5"/>
               </w:numPr>
-              <w:ind w:left="360"/>
               <w:jc w:val="right"/>
               <w:rPr>
                 <w:sz w:val="16"/>
@@ -4146,7 +4061,6 @@
           </w:tcPr>
           <w:p>
             <w:pPr>
-              <w:ind w:left="62" w:right="58"/>
               <w:rPr>
                 <w:sz w:val="16"/>
                 <w:szCs w:val="16"/>
@@ -4170,7 +4084,6 @@
           </w:tcPr>
           <w:p>
             <w:pPr>
-              <w:ind w:left="62" w:right="58"/>
               <w:rPr>
                 <w:sz w:val="16"/>
                 <w:szCs w:val="16"/>
@@ -4267,7 +4180,6 @@
                 <w:ilvl w:val="0"/>
                 <w:numId w:val="5"/>
               </w:numPr>
-              <w:ind w:left="360"/>
               <w:jc w:val="right"/>
               <w:rPr>
                 <w:sz w:val="16"/>
@@ -4285,7 +4197,6 @@
           <w:p>
             <w:pPr>
               <w:pStyle w:val="TableParagraph"/>
-              <w:ind w:left="30"/>
               <w:rPr>
                 <w:sz w:val="16"/>
                 <w:szCs w:val="16"/>
@@ -4309,7 +4220,6 @@
           </w:tcPr>
           <w:p>
             <w:pPr>
-              <w:ind w:left="62" w:right="58"/>
               <w:rPr>
                 <w:sz w:val="16"/>
                 <w:szCs w:val="16"/>
@@ -4406,7 +4316,6 @@
                 <w:ilvl w:val="0"/>
                 <w:numId w:val="5"/>
               </w:numPr>
-              <w:ind w:left="360"/>
               <w:jc w:val="right"/>
               <w:rPr>
                 <w:sz w:val="16"/>
@@ -4424,7 +4333,6 @@
           <w:p>
             <w:pPr>
               <w:pStyle w:val="TableParagraph"/>
-              <w:ind w:left="30"/>
               <w:rPr>
                 <w:sz w:val="16"/>
                 <w:szCs w:val="16"/>
@@ -4448,7 +4356,6 @@
           </w:tcPr>
           <w:p>
             <w:pPr>
-              <w:ind w:left="62" w:right="58"/>
               <w:rPr>
                 <w:sz w:val="16"/>
                 <w:szCs w:val="16"/>
@@ -4545,7 +4452,6 @@
                 <w:ilvl w:val="0"/>
                 <w:numId w:val="5"/>
               </w:numPr>
-              <w:ind w:left="360"/>
               <w:jc w:val="right"/>
               <w:rPr>
                 <w:sz w:val="16"/>
@@ -4563,7 +4469,6 @@
           <w:p>
             <w:pPr>
               <w:pStyle w:val="TableParagraph"/>
-              <w:ind w:left="30"/>
               <w:rPr>
                 <w:sz w:val="16"/>
                 <w:szCs w:val="16"/>
@@ -4587,7 +4492,6 @@
           </w:tcPr>
           <w:p>
             <w:pPr>
-              <w:ind w:left="62" w:right="58"/>
               <w:rPr>
                 <w:sz w:val="16"/>
                 <w:szCs w:val="16"/>
@@ -4747,7 +4651,6 @@
                 <w:ilvl w:val="0"/>
                 <w:numId w:val="7"/>
               </w:numPr>
-              <w:ind w:left="0"/>
               <w:jc w:val="right"/>
               <w:rPr>
                 <w:sz w:val="16"/>
@@ -4764,7 +4667,6 @@
           </w:tcPr>
           <w:p>
             <w:pPr>
-              <w:ind w:left="62" w:right="58"/>
               <w:rPr>
                 <w:sz w:val="16"/>
                 <w:szCs w:val="16"/>
@@ -4788,7 +4690,6 @@
           </w:tcPr>
           <w:p>
             <w:pPr>
-              <w:ind w:left="62" w:right="58"/>
               <w:rPr>
                 <w:sz w:val="16"/>
                 <w:szCs w:val="16"/>
@@ -4885,7 +4786,6 @@
                 <w:ilvl w:val="0"/>
                 <w:numId w:val="7"/>
               </w:numPr>
-              <w:ind w:left="0"/>
               <w:jc w:val="right"/>
               <w:rPr>
                 <w:sz w:val="16"/>
@@ -4902,7 +4802,6 @@
           </w:tcPr>
           <w:p>
             <w:pPr>
-              <w:ind w:left="62" w:right="58"/>
               <w:rPr>
                 <w:sz w:val="16"/>
                 <w:szCs w:val="16"/>
@@ -4926,7 +4825,6 @@
           </w:tcPr>
           <w:p>
             <w:pPr>
-              <w:ind w:left="62" w:right="58"/>
               <w:rPr>
                 <w:sz w:val="16"/>
                 <w:szCs w:val="16"/>
@@ -5086,7 +4984,6 @@
                 <w:ilvl w:val="0"/>
                 <w:numId w:val="9"/>
               </w:numPr>
-              <w:ind w:left="0"/>
               <w:jc w:val="right"/>
               <w:rPr>
                 <w:sz w:val="16"/>
@@ -5103,7 +5000,6 @@
           </w:tcPr>
           <w:p>
             <w:pPr>
-              <w:ind w:left="62" w:right="58"/>
               <w:rPr>
                 <w:sz w:val="16"/>
                 <w:szCs w:val="16"/>
@@ -5127,7 +5023,6 @@
           </w:tcPr>
           <w:p>
             <w:pPr>
-              <w:ind w:left="62" w:right="58"/>
               <w:rPr>
                 <w:sz w:val="16"/>
                 <w:szCs w:val="16"/>
@@ -5224,7 +5119,6 @@
                 <w:ilvl w:val="0"/>
                 <w:numId w:val="9"/>
               </w:numPr>
-              <w:ind w:left="0"/>
               <w:jc w:val="right"/>
               <w:rPr>
                 <w:sz w:val="16"/>
@@ -5241,7 +5135,6 @@
           </w:tcPr>
           <w:p>
             <w:pPr>
-              <w:ind w:left="62" w:right="58"/>
               <w:rPr>
                 <w:sz w:val="16"/>
                 <w:szCs w:val="16"/>
@@ -5265,7 +5158,6 @@
           </w:tcPr>
           <w:p>
             <w:pPr>
-              <w:ind w:left="62" w:right="58"/>
               <w:rPr>
                 <w:sz w:val="16"/>
                 <w:szCs w:val="16"/>
@@ -5362,7 +5254,6 @@
                 <w:ilvl w:val="0"/>
                 <w:numId w:val="9"/>
               </w:numPr>
-              <w:ind w:left="0"/>
               <w:jc w:val="right"/>
               <w:rPr>
                 <w:sz w:val="16"/>
@@ -5379,7 +5270,6 @@
           </w:tcPr>
           <w:p>
             <w:pPr>
-              <w:ind w:left="62" w:right="58"/>
               <w:rPr>
                 <w:sz w:val="16"/>
                 <w:szCs w:val="16"/>
@@ -5403,7 +5293,6 @@
           </w:tcPr>
           <w:p>
             <w:pPr>
-              <w:ind w:left="62" w:right="58"/>
               <w:rPr>
                 <w:bCs/>
                 <w:sz w:val="16"/>
@@ -5501,7 +5390,6 @@
                 <w:ilvl w:val="0"/>
                 <w:numId w:val="9"/>
               </w:numPr>
-              <w:ind w:left="0"/>
               <w:jc w:val="right"/>
               <w:rPr>
                 <w:sz w:val="16"/>
@@ -5518,7 +5406,6 @@
           </w:tcPr>
           <w:p>
             <w:pPr>
-              <w:ind w:left="62" w:right="58"/>
               <w:rPr>
                 <w:sz w:val="16"/>
                 <w:szCs w:val="16"/>
@@ -5542,7 +5429,6 @@
           </w:tcPr>
           <w:p>
             <w:pPr>
-              <w:ind w:left="62" w:right="58"/>
               <w:rPr>
                 <w:bCs/>
                 <w:sz w:val="16"/>
@@ -5640,7 +5526,6 @@
                 <w:ilvl w:val="0"/>
                 <w:numId w:val="9"/>
               </w:numPr>
-              <w:ind w:left="0"/>
               <w:jc w:val="right"/>
               <w:rPr>
                 <w:sz w:val="16"/>
@@ -5657,7 +5542,6 @@
           </w:tcPr>
           <w:p>
             <w:pPr>
-              <w:ind w:left="62" w:right="58"/>
               <w:rPr>
                 <w:sz w:val="16"/>
                 <w:szCs w:val="16"/>
@@ -5681,7 +5565,6 @@
           </w:tcPr>
           <w:p>
             <w:pPr>
-              <w:ind w:left="62" w:right="58"/>
               <w:rPr>
                 <w:bCs/>
                 <w:sz w:val="16"/>
@@ -5779,7 +5662,6 @@
                 <w:ilvl w:val="0"/>
                 <w:numId w:val="9"/>
               </w:numPr>
-              <w:ind w:left="0"/>
               <w:jc w:val="right"/>
               <w:rPr>
                 <w:sz w:val="16"/>
@@ -5796,7 +5678,6 @@
           </w:tcPr>
           <w:p>
             <w:pPr>
-              <w:ind w:left="62" w:right="58"/>
               <w:rPr>
                 <w:sz w:val="16"/>
                 <w:szCs w:val="16"/>
@@ -5820,7 +5701,6 @@
           </w:tcPr>
           <w:p>
             <w:pPr>
-              <w:ind w:left="62" w:right="58"/>
               <w:rPr>
                 <w:bCs/>
                 <w:sz w:val="16"/>
@@ -5981,7 +5861,6 @@
                 <w:ilvl w:val="0"/>
                 <w:numId w:val="11"/>
               </w:numPr>
-              <w:ind w:left="0"/>
               <w:jc w:val="right"/>
               <w:rPr>
                 <w:sz w:val="16"/>
@@ -5998,7 +5877,6 @@
           </w:tcPr>
           <w:p>
             <w:pPr>
-              <w:ind w:left="62" w:right="58"/>
               <w:rPr>
                 <w:sz w:val="16"/>
                 <w:szCs w:val="16"/>
@@ -6022,7 +5900,6 @@
           </w:tcPr>
           <w:p>
             <w:pPr>
-              <w:ind w:left="62" w:right="58"/>
               <w:rPr>
                 <w:sz w:val="16"/>
                 <w:szCs w:val="16"/>
@@ -6119,7 +5996,6 @@
                 <w:ilvl w:val="0"/>
                 <w:numId w:val="11"/>
               </w:numPr>
-              <w:ind w:left="0"/>
               <w:jc w:val="right"/>
               <w:rPr>
                 <w:sz w:val="16"/>
@@ -6136,7 +6012,6 @@
           </w:tcPr>
           <w:p>
             <w:pPr>
-              <w:ind w:left="62" w:right="58"/>
               <w:rPr>
                 <w:sz w:val="16"/>
                 <w:szCs w:val="16"/>
@@ -6160,7 +6035,6 @@
           </w:tcPr>
           <w:p>
             <w:pPr>
-              <w:ind w:left="62" w:right="58"/>
               <w:rPr>
                 <w:sz w:val="16"/>
                 <w:szCs w:val="16"/>
@@ -6257,7 +6131,6 @@
                 <w:ilvl w:val="0"/>
                 <w:numId w:val="11"/>
               </w:numPr>
-              <w:ind w:left="0"/>
               <w:jc w:val="right"/>
               <w:rPr>
                 <w:sz w:val="16"/>
@@ -6274,7 +6147,6 @@
           </w:tcPr>
           <w:p>
             <w:pPr>
-              <w:ind w:left="62" w:right="58"/>
               <w:rPr>
                 <w:sz w:val="16"/>
                 <w:szCs w:val="16"/>
@@ -6298,7 +6170,6 @@
           </w:tcPr>
           <w:p>
             <w:pPr>
-              <w:ind w:left="62" w:right="58"/>
               <w:rPr>
                 <w:bCs/>
                 <w:sz w:val="16"/>
@@ -6396,7 +6267,6 @@
                 <w:ilvl w:val="0"/>
                 <w:numId w:val="11"/>
               </w:numPr>
-              <w:ind w:left="0"/>
               <w:jc w:val="right"/>
               <w:rPr>
                 <w:sz w:val="16"/>
@@ -6413,7 +6283,6 @@
           </w:tcPr>
           <w:p>
             <w:pPr>
-              <w:ind w:left="62" w:right="58"/>
               <w:rPr>
                 <w:sz w:val="16"/>
                 <w:szCs w:val="16"/>
@@ -6437,7 +6306,6 @@
           </w:tcPr>
           <w:p>
             <w:pPr>
-              <w:ind w:left="62" w:right="58"/>
               <w:rPr>
                 <w:bCs/>
                 <w:sz w:val="16"/>
@@ -6535,7 +6403,6 @@
                 <w:ilvl w:val="0"/>
                 <w:numId w:val="11"/>
               </w:numPr>
-              <w:ind w:left="0"/>
               <w:jc w:val="right"/>
               <w:rPr>
                 <w:sz w:val="16"/>
@@ -6552,7 +6419,6 @@
           </w:tcPr>
           <w:p>
             <w:pPr>
-              <w:ind w:left="62" w:right="58"/>
               <w:rPr>
                 <w:sz w:val="16"/>
                 <w:szCs w:val="16"/>
@@ -6576,7 +6442,6 @@
           </w:tcPr>
           <w:p>
             <w:pPr>
-              <w:ind w:left="62" w:right="58"/>
               <w:rPr>
                 <w:bCs/>
                 <w:sz w:val="16"/>
@@ -6674,7 +6539,6 @@
                 <w:ilvl w:val="0"/>
                 <w:numId w:val="11"/>
               </w:numPr>
-              <w:ind w:left="0"/>
               <w:jc w:val="right"/>
               <w:rPr>
                 <w:sz w:val="16"/>
@@ -6691,7 +6555,6 @@
           </w:tcPr>
           <w:p>
             <w:pPr>
-              <w:ind w:left="62" w:right="58"/>
               <w:rPr>
                 <w:sz w:val="16"/>
                 <w:szCs w:val="16"/>
@@ -6715,7 +6578,6 @@
           </w:tcPr>
           <w:p>
             <w:pPr>
-              <w:ind w:left="62" w:right="58"/>
               <w:rPr>
                 <w:bCs/>
                 <w:sz w:val="16"/>
@@ -6876,7 +6738,6 @@
                 <w:ilvl w:val="0"/>
                 <w:numId w:val="17"/>
               </w:numPr>
-              <w:ind w:left="0"/>
               <w:jc w:val="right"/>
               <w:rPr>
                 <w:sz w:val="16"/>
@@ -6893,7 +6754,6 @@
           </w:tcPr>
           <w:p>
             <w:pPr>
-              <w:ind w:left="62" w:right="58"/>
               <w:rPr>
                 <w:sz w:val="16"/>
                 <w:szCs w:val="16"/>
@@ -6917,7 +6777,6 @@
           </w:tcPr>
           <w:p>
             <w:pPr>
-              <w:ind w:left="62" w:right="58"/>
               <w:rPr>
                 <w:sz w:val="16"/>
                 <w:szCs w:val="16"/>
@@ -7014,7 +6873,6 @@
                 <w:ilvl w:val="0"/>
                 <w:numId w:val="17"/>
               </w:numPr>
-              <w:ind w:left="0"/>
               <w:jc w:val="right"/>
               <w:rPr>
                 <w:sz w:val="16"/>
@@ -7031,7 +6889,6 @@
           </w:tcPr>
           <w:p>
             <w:pPr>
-              <w:ind w:left="62" w:right="58"/>
               <w:rPr>
                 <w:sz w:val="16"/>
                 <w:szCs w:val="16"/>
@@ -7055,7 +6912,6 @@
           </w:tcPr>
           <w:p>
             <w:pPr>
-              <w:ind w:left="62" w:right="58"/>
               <w:rPr>
                 <w:sz w:val="16"/>
                 <w:szCs w:val="16"/>
@@ -7152,7 +7008,6 @@
                 <w:ilvl w:val="0"/>
                 <w:numId w:val="17"/>
               </w:numPr>
-              <w:ind w:left="0"/>
               <w:jc w:val="right"/>
               <w:rPr>
                 <w:sz w:val="16"/>
@@ -7169,7 +7024,6 @@
           </w:tcPr>
           <w:p>
             <w:pPr>
-              <w:ind w:left="62" w:right="58"/>
               <w:rPr>
                 <w:sz w:val="16"/>
                 <w:szCs w:val="16"/>
@@ -7193,7 +7047,6 @@
           </w:tcPr>
           <w:p>
             <w:pPr>
-              <w:ind w:left="62" w:right="58"/>
               <w:rPr>
                 <w:bCs/>
                 <w:sz w:val="16"/>
@@ -7291,7 +7144,6 @@
                 <w:ilvl w:val="0"/>
                 <w:numId w:val="17"/>
               </w:numPr>
-              <w:ind w:left="0"/>
               <w:jc w:val="right"/>
               <w:rPr>
                 <w:sz w:val="16"/>
@@ -7308,7 +7160,6 @@
           </w:tcPr>
           <w:p>
             <w:pPr>
-              <w:ind w:left="62" w:right="58"/>
               <w:rPr>
                 <w:sz w:val="16"/>
                 <w:szCs w:val="16"/>
@@ -7332,7 +7183,6 @@
           </w:tcPr>
           <w:p>
             <w:pPr>
-              <w:ind w:left="62" w:right="58"/>
               <w:rPr>
                 <w:bCs/>
                 <w:sz w:val="16"/>
@@ -7430,7 +7280,6 @@
                 <w:ilvl w:val="0"/>
                 <w:numId w:val="17"/>
               </w:numPr>
-              <w:ind w:left="0"/>
               <w:jc w:val="right"/>
               <w:rPr>
                 <w:sz w:val="16"/>
@@ -7447,7 +7296,6 @@
           </w:tcPr>
           <w:p>
             <w:pPr>
-              <w:ind w:left="62" w:right="58"/>
               <w:rPr>
                 <w:sz w:val="16"/>
                 <w:szCs w:val="16"/>
@@ -7471,7 +7319,6 @@
           </w:tcPr>
           <w:p>
             <w:pPr>
-              <w:ind w:left="62" w:right="58"/>
               <w:rPr>
                 <w:bCs/>
                 <w:sz w:val="16"/>
@@ -7569,7 +7416,6 @@
                 <w:ilvl w:val="0"/>
                 <w:numId w:val="17"/>
               </w:numPr>
-              <w:ind w:left="0"/>
               <w:jc w:val="right"/>
               <w:rPr>
                 <w:sz w:val="16"/>
@@ -7586,7 +7432,6 @@
           </w:tcPr>
           <w:p>
             <w:pPr>
-              <w:ind w:left="62" w:right="58"/>
               <w:rPr>
                 <w:sz w:val="16"/>
                 <w:szCs w:val="16"/>
@@ -7610,7 +7455,6 @@
           </w:tcPr>
           <w:p>
             <w:pPr>
-              <w:ind w:left="62" w:right="58"/>
               <w:rPr>
                 <w:bCs/>
                 <w:sz w:val="16"/>
@@ -7708,7 +7552,6 @@
                 <w:ilvl w:val="0"/>
                 <w:numId w:val="17"/>
               </w:numPr>
-              <w:ind w:left="0"/>
               <w:jc w:val="right"/>
               <w:rPr>
                 <w:sz w:val="16"/>
@@ -7725,7 +7568,6 @@
           </w:tcPr>
           <w:p>
             <w:pPr>
-              <w:ind w:left="62" w:right="58"/>
               <w:rPr>
                 <w:sz w:val="16"/>
                 <w:szCs w:val="16"/>
@@ -7749,7 +7591,6 @@
           </w:tcPr>
           <w:p>
             <w:pPr>
-              <w:ind w:left="62" w:right="58"/>
               <w:rPr>
                 <w:bCs/>
                 <w:sz w:val="16"/>
@@ -7847,7 +7688,6 @@
                 <w:ilvl w:val="0"/>
                 <w:numId w:val="17"/>
               </w:numPr>
-              <w:ind w:left="0"/>
               <w:jc w:val="right"/>
               <w:rPr>
                 <w:sz w:val="16"/>
@@ -7864,7 +7704,6 @@
           </w:tcPr>
           <w:p>
             <w:pPr>
-              <w:ind w:left="62" w:right="58"/>
               <w:rPr>
                 <w:sz w:val="16"/>
                 <w:szCs w:val="16"/>
@@ -7888,7 +7727,6 @@
           </w:tcPr>
           <w:p>
             <w:pPr>
-              <w:ind w:left="62" w:right="58"/>
               <w:rPr>
                 <w:bCs/>
                 <w:sz w:val="16"/>
@@ -7986,7 +7824,6 @@
                 <w:ilvl w:val="0"/>
                 <w:numId w:val="17"/>
               </w:numPr>
-              <w:ind w:left="0"/>
               <w:jc w:val="right"/>
               <w:rPr>
                 <w:sz w:val="16"/>
@@ -8003,7 +7840,6 @@
           </w:tcPr>
           <w:p>
             <w:pPr>
-              <w:ind w:left="62" w:right="58"/>
               <w:rPr>
                 <w:sz w:val="16"/>
                 <w:szCs w:val="16"/>
@@ -8027,7 +7863,6 @@
           </w:tcPr>
           <w:p>
             <w:pPr>
-              <w:ind w:left="62" w:right="58"/>
               <w:rPr>
                 <w:bCs/>
                 <w:sz w:val="16"/>
@@ -8125,7 +7960,6 @@
                 <w:ilvl w:val="0"/>
                 <w:numId w:val="17"/>
               </w:numPr>
-              <w:ind w:left="0"/>
               <w:jc w:val="right"/>
               <w:rPr>
                 <w:sz w:val="16"/>
@@ -8142,7 +7976,6 @@
           </w:tcPr>
           <w:p>
             <w:pPr>
-              <w:ind w:left="62" w:right="58"/>
               <w:rPr>
                 <w:sz w:val="16"/>
                 <w:szCs w:val="16"/>
@@ -8166,7 +7999,6 @@
           </w:tcPr>
           <w:p>
             <w:pPr>
-              <w:ind w:left="62" w:right="58"/>
               <w:rPr>
                 <w:bCs/>
                 <w:sz w:val="16"/>
@@ -8264,7 +8096,6 @@
                 <w:ilvl w:val="0"/>
                 <w:numId w:val="17"/>
               </w:numPr>
-              <w:ind w:left="0"/>
               <w:jc w:val="right"/>
               <w:rPr>
                 <w:sz w:val="16"/>
@@ -8281,7 +8112,6 @@
           </w:tcPr>
           <w:p>
             <w:pPr>
-              <w:ind w:left="62" w:right="58"/>
               <w:rPr>
                 <w:sz w:val="16"/>
                 <w:szCs w:val="16"/>
@@ -8305,7 +8135,6 @@
           </w:tcPr>
           <w:p>
             <w:pPr>
-              <w:ind w:left="62" w:right="58"/>
               <w:rPr>
                 <w:bCs/>
                 <w:sz w:val="16"/>
@@ -8411,7 +8240,6 @@
                 <w:ilvl w:val="0"/>
                 <w:numId w:val="17"/>
               </w:numPr>
-              <w:ind w:left="0"/>
               <w:jc w:val="right"/>
               <w:rPr>
                 <w:sz w:val="16"/>
@@ -8428,7 +8256,6 @@
           </w:tcPr>
           <w:p>
             <w:pPr>
-              <w:ind w:left="62" w:right="58"/>
               <w:rPr>
                 <w:sz w:val="16"/>
                 <w:szCs w:val="16"/>
@@ -8452,7 +8279,6 @@
           </w:tcPr>
           <w:p>
             <w:pPr>
-              <w:ind w:left="62" w:right="58"/>
               <w:rPr>
                 <w:bCs/>
                 <w:sz w:val="16"/>
@@ -8629,7 +8455,6 @@
                 <w:ilvl w:val="0"/>
                 <w:numId w:val="18"/>
               </w:numPr>
-              <w:ind w:left="0"/>
               <w:jc w:val="right"/>
               <w:rPr>
                 <w:sz w:val="16"/>
@@ -8646,7 +8471,6 @@
           </w:tcPr>
           <w:p>
             <w:pPr>
-              <w:ind w:left="62" w:right="58"/>
               <w:rPr>
                 <w:sz w:val="16"/>
                 <w:szCs w:val="16"/>
@@ -8670,7 +8494,6 @@
           </w:tcPr>
           <w:p>
             <w:pPr>
-              <w:ind w:left="62" w:right="58"/>
               <w:rPr>
                 <w:sz w:val="16"/>
                 <w:szCs w:val="16"/>
@@ -8776,7 +8599,6 @@
                 <w:ilvl w:val="0"/>
                 <w:numId w:val="18"/>
               </w:numPr>
-              <w:ind w:left="0"/>
               <w:jc w:val="right"/>
               <w:rPr>
                 <w:sz w:val="16"/>
@@ -8793,7 +8615,6 @@
           </w:tcPr>
           <w:p>
             <w:pPr>
-              <w:ind w:left="62" w:right="58"/>
               <w:rPr>
                 <w:sz w:val="16"/>
                 <w:szCs w:val="16"/>
@@ -8817,7 +8638,6 @@
           </w:tcPr>
           <w:p>
             <w:pPr>
-              <w:ind w:left="62" w:right="58"/>
               <w:rPr>
                 <w:sz w:val="16"/>
                 <w:szCs w:val="16"/>
@@ -8923,7 +8743,6 @@
                 <w:ilvl w:val="0"/>
                 <w:numId w:val="18"/>
               </w:numPr>
-              <w:ind w:left="0"/>
               <w:jc w:val="right"/>
               <w:rPr>
                 <w:sz w:val="16"/>
@@ -8940,7 +8759,6 @@
           </w:tcPr>
           <w:p>
             <w:pPr>
-              <w:ind w:left="62" w:right="58"/>
               <w:rPr>
                 <w:sz w:val="16"/>
                 <w:szCs w:val="16"/>
@@ -8964,7 +8782,6 @@
           </w:tcPr>
           <w:p>
             <w:pPr>
-              <w:ind w:left="62" w:right="58"/>
               <w:rPr>
                 <w:bCs/>
                 <w:sz w:val="16"/>
@@ -9071,7 +8888,6 @@
                 <w:ilvl w:val="0"/>
                 <w:numId w:val="18"/>
               </w:numPr>
-              <w:ind w:left="0"/>
               <w:jc w:val="right"/>
               <w:rPr>
                 <w:sz w:val="16"/>
@@ -9088,7 +8904,6 @@
           </w:tcPr>
           <w:p>
             <w:pPr>
-              <w:ind w:left="62" w:right="58"/>
               <w:rPr>
                 <w:sz w:val="16"/>
                 <w:szCs w:val="16"/>
@@ -9112,7 +8927,6 @@
           </w:tcPr>
           <w:p>
             <w:pPr>
-              <w:ind w:left="62" w:right="58"/>
               <w:rPr>
                 <w:bCs/>
                 <w:sz w:val="16"/>
@@ -9219,7 +9033,6 @@
                 <w:ilvl w:val="0"/>
                 <w:numId w:val="18"/>
               </w:numPr>
-              <w:ind w:left="0"/>
               <w:jc w:val="right"/>
               <w:rPr>
                 <w:sz w:val="16"/>
@@ -9236,7 +9049,6 @@
           </w:tcPr>
           <w:p>
             <w:pPr>
-              <w:ind w:left="62" w:right="58"/>
               <w:rPr>
                 <w:sz w:val="16"/>
                 <w:szCs w:val="16"/>
@@ -9260,7 +9072,6 @@
           </w:tcPr>
           <w:p>
             <w:pPr>
-              <w:ind w:left="62" w:right="58"/>
               <w:rPr>
                 <w:bCs/>
                 <w:sz w:val="16"/>
@@ -9439,7 +9250,6 @@
                 <w:ilvl w:val="0"/>
                 <w:numId w:val="12"/>
               </w:numPr>
-              <w:ind w:left="0"/>
               <w:jc w:val="right"/>
               <w:rPr>
                 <w:sz w:val="16"/>
@@ -9456,7 +9266,6 @@
           </w:tcPr>
           <w:p>
             <w:pPr>
-              <w:ind w:left="62" w:right="58"/>
               <w:rPr>
                 <w:sz w:val="16"/>
                 <w:szCs w:val="16"/>
@@ -9480,7 +9289,6 @@
           </w:tcPr>
           <w:p>
             <w:pPr>
-              <w:ind w:left="62" w:right="58"/>
               <w:rPr>
                 <w:sz w:val="16"/>
                 <w:szCs w:val="16"/>
@@ -9577,7 +9385,6 @@
                 <w:ilvl w:val="0"/>
                 <w:numId w:val="12"/>
               </w:numPr>
-              <w:ind w:left="0"/>
               <w:jc w:val="right"/>
               <w:rPr>
                 <w:sz w:val="16"/>
@@ -9594,7 +9401,6 @@
           </w:tcPr>
           <w:p>
             <w:pPr>
-              <w:ind w:left="62" w:right="58"/>
               <w:rPr>
                 <w:sz w:val="16"/>
                 <w:szCs w:val="16"/>
@@ -9618,7 +9424,6 @@
           </w:tcPr>
           <w:p>
             <w:pPr>
-              <w:ind w:left="62" w:right="58"/>
               <w:rPr>
                 <w:sz w:val="16"/>
                 <w:szCs w:val="16"/>
@@ -9715,7 +9520,6 @@
                 <w:ilvl w:val="0"/>
                 <w:numId w:val="12"/>
               </w:numPr>
-              <w:ind w:left="0"/>
               <w:jc w:val="right"/>
               <w:rPr>
                 <w:sz w:val="16"/>
@@ -9732,7 +9536,6 @@
           </w:tcPr>
           <w:p>
             <w:pPr>
-              <w:ind w:left="62" w:right="58"/>
               <w:rPr>
                 <w:sz w:val="16"/>
                 <w:szCs w:val="16"/>
@@ -9757,7 +9560,6 @@
           </w:tcPr>
           <w:p>
             <w:pPr>
-              <w:ind w:left="62" w:right="58"/>
               <w:rPr>
                 <w:bCs/>
                 <w:sz w:val="16"/>
@@ -9918,7 +9720,6 @@
                 <w:ilvl w:val="0"/>
                 <w:numId w:val="13"/>
               </w:numPr>
-              <w:ind w:left="0"/>
               <w:jc w:val="right"/>
               <w:rPr>
                 <w:sz w:val="16"/>
@@ -9936,7 +9737,6 @@
           <w:p>
             <w:pPr>
               <w:pStyle w:val="TableParagraph"/>
-              <w:ind w:left="30"/>
               <w:rPr>
                 <w:sz w:val="16"/>
                 <w:szCs w:val="16"/>
@@ -9960,7 +9760,6 @@
           </w:tcPr>
           <w:p>
             <w:pPr>
-              <w:ind w:left="62" w:right="58"/>
               <w:rPr>
                 <w:sz w:val="16"/>
                 <w:szCs w:val="16"/>
@@ -10057,7 +9856,6 @@
                 <w:ilvl w:val="0"/>
                 <w:numId w:val="13"/>
               </w:numPr>
-              <w:ind w:left="0"/>
               <w:jc w:val="right"/>
               <w:rPr>
                 <w:sz w:val="16"/>
@@ -10075,7 +9873,6 @@
           <w:p>
             <w:pPr>
               <w:pStyle w:val="TableParagraph"/>
-              <w:ind w:left="26"/>
               <w:rPr>
                 <w:sz w:val="16"/>
                 <w:szCs w:val="16"/>
@@ -10100,7 +9897,6 @@
           </w:tcPr>
           <w:p>
             <w:pPr>
-              <w:ind w:left="62" w:right="58"/>
               <w:rPr>
                 <w:sz w:val="16"/>
                 <w:szCs w:val="16"/>
@@ -10197,7 +9993,6 @@
                 <w:ilvl w:val="0"/>
                 <w:numId w:val="13"/>
               </w:numPr>
-              <w:ind w:left="0"/>
               <w:jc w:val="right"/>
               <w:rPr>
                 <w:sz w:val="16"/>
@@ -10214,7 +10009,6 @@
           </w:tcPr>
           <w:p>
             <w:pPr>
-              <w:ind w:left="62" w:right="58"/>
               <w:rPr>
                 <w:sz w:val="16"/>
                 <w:szCs w:val="16"/>
@@ -10238,7 +10032,6 @@
           </w:tcPr>
           <w:p>
             <w:pPr>
-              <w:ind w:left="62" w:right="58"/>
               <w:rPr>
                 <w:bCs/>
                 <w:sz w:val="16"/>
@@ -10336,7 +10129,6 @@
                 <w:ilvl w:val="0"/>
                 <w:numId w:val="13"/>
               </w:numPr>
-              <w:ind w:left="0"/>
               <w:jc w:val="right"/>
               <w:rPr>
                 <w:sz w:val="16"/>
@@ -10353,7 +10145,6 @@
           </w:tcPr>
           <w:p>
             <w:pPr>
-              <w:ind w:left="62" w:right="58"/>
               <w:rPr>
                 <w:sz w:val="16"/>
                 <w:szCs w:val="16"/>
@@ -10377,7 +10168,6 @@
           </w:tcPr>
           <w:p>
             <w:pPr>
-              <w:ind w:left="62" w:right="58"/>
               <w:rPr>
                 <w:bCs/>
                 <w:sz w:val="16"/>
@@ -10538,7 +10328,6 @@
                 <w:ilvl w:val="0"/>
                 <w:numId w:val="14"/>
               </w:numPr>
-              <w:ind w:left="0"/>
               <w:jc w:val="right"/>
               <w:rPr>
                 <w:sz w:val="16"/>
@@ -10556,7 +10345,6 @@
           <w:p>
             <w:pPr>
               <w:pStyle w:val="TableParagraph"/>
-              <w:ind w:left="30"/>
               <w:rPr>
                 <w:sz w:val="16"/>
                 <w:szCs w:val="16"/>
@@ -10580,7 +10368,6 @@
           </w:tcPr>
           <w:p>
             <w:pPr>
-              <w:ind w:left="62" w:right="58"/>
               <w:rPr>
                 <w:sz w:val="16"/>
                 <w:szCs w:val="16"/>
@@ -10677,7 +10464,6 @@
                 <w:ilvl w:val="0"/>
                 <w:numId w:val="14"/>
               </w:numPr>
-              <w:ind w:left="0"/>
               <w:jc w:val="right"/>
               <w:rPr>
                 <w:sz w:val="16"/>
@@ -10695,7 +10481,6 @@
           <w:p>
             <w:pPr>
               <w:pStyle w:val="TableParagraph"/>
-              <w:ind w:left="26"/>
               <w:rPr>
                 <w:sz w:val="16"/>
                 <w:szCs w:val="16"/>
@@ -10719,7 +10504,6 @@
           </w:tcPr>
           <w:p>
             <w:pPr>
-              <w:ind w:left="62" w:right="58"/>
               <w:rPr>
                 <w:sz w:val="16"/>
                 <w:szCs w:val="16"/>
@@ -10816,7 +10600,6 @@
                 <w:ilvl w:val="0"/>
                 <w:numId w:val="14"/>
               </w:numPr>
-              <w:ind w:left="0"/>
               <w:jc w:val="right"/>
               <w:rPr>
                 <w:sz w:val="16"/>
@@ -10833,7 +10616,6 @@
           </w:tcPr>
           <w:p>
             <w:pPr>
-              <w:ind w:left="62" w:right="58"/>
               <w:rPr>
                 <w:sz w:val="16"/>
                 <w:szCs w:val="16"/>
@@ -10857,7 +10639,6 @@
           </w:tcPr>
           <w:p>
             <w:pPr>
-              <w:ind w:left="62" w:right="58"/>
               <w:rPr>
                 <w:bCs/>
                 <w:sz w:val="16"/>
@@ -11018,7 +10799,6 @@
                 <w:ilvl w:val="0"/>
                 <w:numId w:val="15"/>
               </w:numPr>
-              <w:ind w:left="0"/>
               <w:jc w:val="right"/>
               <w:rPr>
                 <w:sz w:val="16"/>
@@ -11036,7 +10816,6 @@
           <w:p>
             <w:pPr>
               <w:pStyle w:val="TableParagraph"/>
-              <w:ind w:left="30"/>
               <w:rPr>
                 <w:sz w:val="16"/>
                 <w:szCs w:val="16"/>
@@ -11060,7 +10839,6 @@
           </w:tcPr>
           <w:p>
             <w:pPr>
-              <w:ind w:left="62" w:right="58"/>
               <w:rPr>
                 <w:sz w:val="16"/>
                 <w:szCs w:val="16"/>
@@ -11157,7 +10935,6 @@
                 <w:ilvl w:val="0"/>
                 <w:numId w:val="15"/>
               </w:numPr>
-              <w:ind w:left="0"/>
               <w:jc w:val="right"/>
               <w:rPr>
                 <w:sz w:val="16"/>
@@ -11175,7 +10952,6 @@
           <w:p>
             <w:pPr>
               <w:pStyle w:val="TableParagraph"/>
-              <w:ind w:left="26"/>
               <w:rPr>
                 <w:sz w:val="16"/>
                 <w:szCs w:val="16"/>
@@ -11199,7 +10975,6 @@
           </w:tcPr>
           <w:p>
             <w:pPr>
-              <w:ind w:left="62" w:right="58"/>
               <w:rPr>
                 <w:sz w:val="16"/>
                 <w:szCs w:val="16"/>
@@ -11296,7 +11071,6 @@
                 <w:ilvl w:val="0"/>
                 <w:numId w:val="15"/>
               </w:numPr>
-              <w:ind w:left="0"/>
               <w:jc w:val="right"/>
               <w:rPr>
                 <w:sz w:val="16"/>
@@ -11313,7 +11087,6 @@
           </w:tcPr>
           <w:p>
             <w:pPr>
-              <w:ind w:left="62" w:right="58"/>
               <w:rPr>
                 <w:sz w:val="16"/>
                 <w:szCs w:val="16"/>
@@ -11337,7 +11110,6 @@
           </w:tcPr>
           <w:p>
             <w:pPr>
-              <w:ind w:left="62" w:right="58"/>
               <w:rPr>
                 <w:sz w:val="16"/>
                 <w:szCs w:val="16"/>
@@ -11420,7 +11192,6 @@
                 <w:ilvl w:val="0"/>
                 <w:numId w:val="15"/>
               </w:numPr>
-              <w:ind w:left="0"/>
               <w:jc w:val="right"/>
               <w:rPr>
                 <w:sz w:val="16"/>
@@ -11437,7 +11208,6 @@
           </w:tcPr>
           <w:p>
             <w:pPr>
-              <w:ind w:left="62" w:right="58"/>
               <w:rPr>
                 <w:sz w:val="16"/>
                 <w:szCs w:val="16"/>
@@ -11461,7 +11231,6 @@
           </w:tcPr>
           <w:p>
             <w:pPr>
-              <w:ind w:left="62" w:right="58"/>
               <w:rPr>
                 <w:sz w:val="16"/>
                 <w:szCs w:val="16"/>
@@ -11544,7 +11313,6 @@
                 <w:ilvl w:val="0"/>
                 <w:numId w:val="15"/>
               </w:numPr>
-              <w:ind w:left="0"/>
               <w:jc w:val="right"/>
               <w:rPr>
                 <w:sz w:val="16"/>
@@ -11561,7 +11329,6 @@
           </w:tcPr>
           <w:p>
             <w:pPr>
-              <w:ind w:left="62" w:right="58"/>
               <w:rPr>
                 <w:sz w:val="16"/>
                 <w:szCs w:val="16"/>
@@ -11585,7 +11352,6 @@
           </w:tcPr>
           <w:p>
             <w:pPr>
-              <w:ind w:left="62" w:right="58"/>
               <w:rPr>
                 <w:sz w:val="16"/>
                 <w:szCs w:val="16"/>
@@ -11668,7 +11434,6 @@
                 <w:ilvl w:val="0"/>
                 <w:numId w:val="15"/>
               </w:numPr>
-              <w:ind w:left="0"/>
               <w:jc w:val="right"/>
               <w:rPr>
                 <w:sz w:val="16"/>
@@ -11685,7 +11450,6 @@
           </w:tcPr>
           <w:p>
             <w:pPr>
-              <w:ind w:left="62" w:right="58"/>
               <w:rPr>
                 <w:sz w:val="16"/>
                 <w:szCs w:val="16"/>
@@ -11709,7 +11473,6 @@
           </w:tcPr>
           <w:p>
             <w:pPr>
-              <w:ind w:left="62" w:right="58"/>
               <w:rPr>
                 <w:sz w:val="16"/>
                 <w:szCs w:val="16"/>
@@ -11818,7 +11581,6 @@
           </w:tcPr>
           <w:p>
             <w:pPr>
-              <w:ind w:left="62" w:right="58"/>
               <w:rPr>
                 <w:sz w:val="16"/>
                 <w:szCs w:val="16"/>
@@ -11843,7 +11605,6 @@
           </w:tcPr>
           <w:p>
             <w:pPr>
-              <w:ind w:left="62" w:right="58"/>
               <w:rPr>
                 <w:sz w:val="16"/>
                 <w:szCs w:val="16"/>
@@ -11907,7 +11668,6 @@
           </w:tcPr>
           <w:p>
             <w:pPr>
-              <w:ind w:left="62" w:right="58"/>
               <w:rPr>
                 <w:sz w:val="16"/>
                 <w:szCs w:val="16"/>
@@ -11931,7 +11691,6 @@
           </w:tcPr>
           <w:p>
             <w:pPr>
-              <w:ind w:left="62" w:right="58"/>
               <w:rPr>
                 <w:sz w:val="16"/>
                 <w:szCs w:val="16"/>
@@ -11953,7 +11712,6 @@
           </w:tcPr>
           <w:p>
             <w:pPr>
-              <w:ind w:left="62" w:right="58"/>
               <w:rPr>
                 <w:sz w:val="16"/>
                 <w:szCs w:val="16"/>
@@ -11977,7 +11735,6 @@
           </w:tcPr>
           <w:p>
             <w:pPr>
-              <w:ind w:left="62" w:right="58"/>
               <w:rPr>
                 <w:sz w:val="16"/>
                 <w:szCs w:val="16"/>
@@ -12032,7 +11789,6 @@
           <w:p>
             <w:pPr>
               <w:pStyle w:val="TableParagraph"/>
-              <w:ind w:left="30"/>
               <w:rPr>
                 <w:sz w:val="16"/>
                 <w:szCs w:val="16"/>
@@ -12067,7 +11823,6 @@
                 <w:ilvl w:val="0"/>
                 <w:numId w:val="16"/>
               </w:numPr>
-              <w:ind w:left="0"/>
               <w:jc w:val="right"/>
               <w:rPr>
                 <w:sz w:val="16"/>
@@ -12086,7 +11841,6 @@
           <w:p>
             <w:pPr>
               <w:pStyle w:val="TableParagraph"/>
-              <w:ind w:left="30"/>
               <w:rPr>
                 <w:sz w:val="16"/>
                 <w:szCs w:val="16"/>
@@ -12110,7 +11864,6 @@
           </w:tcPr>
           <w:p>
             <w:pPr>
-              <w:ind w:left="62" w:right="58"/>
               <w:rPr>
                 <w:sz w:val="16"/>
                 <w:szCs w:val="16"/>
@@ -12194,7 +11947,6 @@
                 <w:ilvl w:val="0"/>
                 <w:numId w:val="16"/>
               </w:numPr>
-              <w:ind w:left="0"/>
               <w:jc w:val="right"/>
               <w:rPr>
                 <w:sz w:val="16"/>
@@ -12213,7 +11965,6 @@
           <w:p>
             <w:pPr>
               <w:pStyle w:val="TableParagraph"/>
-              <w:ind w:left="30"/>
               <w:rPr>
                 <w:sz w:val="16"/>
                 <w:szCs w:val="16"/>
@@ -12237,7 +11988,6 @@
           </w:tcPr>
           <w:p>
             <w:pPr>
-              <w:ind w:left="62" w:right="58"/>
               <w:rPr>
                 <w:sz w:val="16"/>
                 <w:szCs w:val="16"/>
@@ -12321,7 +12071,6 @@
                 <w:ilvl w:val="0"/>
                 <w:numId w:val="16"/>
               </w:numPr>
-              <w:ind w:left="0"/>
               <w:jc w:val="right"/>
               <w:rPr>
                 <w:sz w:val="16"/>
@@ -12340,7 +12089,6 @@
           <w:p>
             <w:pPr>
               <w:pStyle w:val="TableParagraph"/>
-              <w:ind w:left="30"/>
               <w:rPr>
                 <w:sz w:val="16"/>
                 <w:szCs w:val="16"/>
@@ -12364,7 +12112,6 @@
           </w:tcPr>
           <w:p>
             <w:pPr>
-              <w:ind w:left="62" w:right="58"/>
               <w:rPr>
                 <w:sz w:val="16"/>
                 <w:szCs w:val="16"/>
@@ -12448,7 +12195,6 @@
                 <w:ilvl w:val="0"/>
                 <w:numId w:val="16"/>
               </w:numPr>
-              <w:ind w:left="0"/>
               <w:jc w:val="right"/>
               <w:rPr>
                 <w:sz w:val="16"/>
@@ -12467,7 +12213,6 @@
           <w:p>
             <w:pPr>
               <w:pStyle w:val="TableParagraph"/>
-              <w:ind w:left="30"/>
               <w:rPr>
                 <w:sz w:val="16"/>
                 <w:szCs w:val="16"/>
@@ -12491,7 +12236,6 @@
           </w:tcPr>
           <w:p>
             <w:pPr>
-              <w:ind w:left="62" w:right="58"/>
               <w:rPr>
                 <w:sz w:val="16"/>
                 <w:szCs w:val="16"/>
@@ -12575,7 +12319,6 @@
                 <w:ilvl w:val="0"/>
                 <w:numId w:val="16"/>
               </w:numPr>
-              <w:ind w:left="0"/>
               <w:jc w:val="right"/>
               <w:rPr>
                 <w:sz w:val="16"/>
@@ -12594,7 +12337,6 @@
           <w:p>
             <w:pPr>
               <w:pStyle w:val="TableParagraph"/>
-              <w:ind w:left="30"/>
               <w:rPr>
                 <w:sz w:val="16"/>
                 <w:szCs w:val="16"/>
@@ -12618,7 +12360,6 @@
           </w:tcPr>
           <w:p>
             <w:pPr>
-              <w:ind w:left="62" w:right="58"/>
               <w:rPr>
                 <w:sz w:val="16"/>
                 <w:szCs w:val="16"/>
@@ -12702,7 +12443,6 @@
                 <w:ilvl w:val="0"/>
                 <w:numId w:val="16"/>
               </w:numPr>
-              <w:ind w:left="0"/>
               <w:jc w:val="right"/>
               <w:rPr>
                 <w:sz w:val="16"/>
@@ -12721,7 +12461,6 @@
           <w:p>
             <w:pPr>
               <w:pStyle w:val="TableParagraph"/>
-              <w:ind w:left="30"/>
               <w:rPr>
                 <w:sz w:val="16"/>
                 <w:szCs w:val="16"/>
@@ -12745,7 +12484,6 @@
           </w:tcPr>
           <w:p>
             <w:pPr>
-              <w:ind w:left="62" w:right="58"/>
               <w:rPr>
                 <w:sz w:val="16"/>
                 <w:szCs w:val="16"/>
@@ -12829,7 +12567,6 @@
                 <w:ilvl w:val="0"/>
                 <w:numId w:val="16"/>
               </w:numPr>
-              <w:ind w:left="0"/>
               <w:jc w:val="right"/>
               <w:rPr>
                 <w:sz w:val="16"/>
@@ -12848,7 +12585,6 @@
           <w:p>
             <w:pPr>
               <w:pStyle w:val="TableParagraph"/>
-              <w:ind w:left="30"/>
               <w:rPr>
                 <w:sz w:val="16"/>
                 <w:szCs w:val="16"/>
@@ -12872,7 +12608,6 @@
           </w:tcPr>
           <w:p>
             <w:pPr>
-              <w:ind w:left="62" w:right="58"/>
               <w:rPr>
                 <w:sz w:val="16"/>
                 <w:szCs w:val="16"/>
@@ -12956,7 +12691,6 @@
                 <w:ilvl w:val="0"/>
                 <w:numId w:val="16"/>
               </w:numPr>
-              <w:ind w:left="0"/>
               <w:jc w:val="right"/>
               <w:rPr>
                 <w:sz w:val="16"/>
@@ -12975,7 +12709,6 @@
           <w:p>
             <w:pPr>
               <w:pStyle w:val="TableParagraph"/>
-              <w:ind w:left="30"/>
               <w:rPr>
                 <w:sz w:val="16"/>
                 <w:szCs w:val="16"/>
@@ -12999,7 +12732,6 @@
           </w:tcPr>
           <w:p>
             <w:pPr>
-              <w:ind w:left="62" w:right="58"/>
               <w:rPr>
                 <w:sz w:val="16"/>
                 <w:szCs w:val="16"/>
@@ -13111,7 +12843,6 @@
           <w:p>
             <w:pPr>
               <w:pStyle w:val="TableParagraph"/>
-              <w:ind w:left="30"/>
               <w:rPr>
                 <w:sz w:val="16"/>
                 <w:szCs w:val="16"/>
@@ -13182,7 +12913,6 @@
           <w:p>
             <w:pPr>
               <w:pStyle w:val="TableParagraph"/>
-              <w:ind w:left="31"/>
               <w:rPr>
                 <w:sz w:val="16"/>
                 <w:szCs w:val="16"/>
@@ -13272,7 +13002,6 @@
           <w:p>
             <w:pPr>
               <w:pStyle w:val="TableParagraph"/>
-              <w:ind w:left="30"/>
               <w:rPr>
                 <w:sz w:val="16"/>
                 <w:szCs w:val="16"/>
@@ -13412,7 +13141,6 @@
           <w:p>
             <w:pPr>
               <w:pStyle w:val="TableParagraph"/>
-              <w:ind w:left="31"/>
               <w:rPr>
                 <w:sz w:val="16"/>
                 <w:szCs w:val="16"/>
@@ -13437,7 +13165,6 @@
           <w:p>
             <w:pPr>
               <w:pStyle w:val="TableParagraph"/>
-              <w:ind w:left="56" w:right="49"/>
               <w:rPr>
                 <w:sz w:val="16"/>
                 <w:szCs w:val="16"/>
@@ -13536,7 +13263,6 @@
           <w:p>
             <w:pPr>
               <w:pStyle w:val="TableParagraph"/>
-              <w:ind w:left="31"/>
               <w:rPr>
                 <w:sz w:val="16"/>
                 <w:szCs w:val="16"/>
@@ -13561,7 +13287,6 @@
           <w:p>
             <w:pPr>
               <w:pStyle w:val="TableParagraph"/>
-              <w:ind w:left="56" w:right="49"/>
               <w:rPr>
                 <w:sz w:val="16"/>
                 <w:szCs w:val="16"/>
@@ -13656,7 +13381,6 @@
           <w:p>
             <w:pPr>
               <w:pStyle w:val="TableParagraph"/>
-              <w:ind w:left="31"/>
               <w:rPr>
                 <w:sz w:val="16"/>
                 <w:szCs w:val="16"/>
@@ -13682,7 +13406,6 @@
           <w:p>
             <w:pPr>
               <w:pStyle w:val="TableParagraph"/>
-              <w:ind w:left="56" w:right="49"/>
               <w:rPr>
                 <w:sz w:val="16"/>
                 <w:szCs w:val="16"/>
@@ -13763,7 +13486,6 @@
           <w:p>
             <w:pPr>
               <w:pStyle w:val="TableParagraph"/>
-              <w:ind w:left="31"/>
               <w:rPr>
                 <w:sz w:val="16"/>
                 <w:szCs w:val="16"/>
@@ -13781,7 +13503,6 @@
           <w:p>
             <w:pPr>
               <w:pStyle w:val="TableParagraph"/>
-              <w:ind w:left="56" w:right="49"/>
               <w:rPr>
                 <w:sz w:val="16"/>
                 <w:szCs w:val="16"/>
@@ -13839,7 +13560,6 @@
           <w:p>
             <w:pPr>
               <w:pStyle w:val="TableParagraph"/>
-              <w:ind w:left="31"/>
               <w:rPr>
                 <w:sz w:val="16"/>
                 <w:szCs w:val="16"/>
@@ -13874,7 +13594,6 @@
           <w:p>
             <w:pPr>
               <w:pStyle w:val="TableParagraph"/>
-              <w:ind w:left="56" w:right="49"/>
               <w:rPr>
                 <w:sz w:val="16"/>
                 <w:szCs w:val="16"/>
@@ -13964,7 +13683,6 @@
           <w:p>
             <w:pPr>
               <w:pStyle w:val="TableParagraph"/>
-              <w:ind w:left="31"/>
               <w:rPr>
                 <w:sz w:val="16"/>
                 <w:szCs w:val="16"/>
@@ -13992,7 +13710,6 @@
           <w:p>
             <w:pPr>
               <w:pStyle w:val="TableParagraph"/>
-              <w:ind w:left="56" w:right="49"/>
               <w:rPr>
                 <w:sz w:val="16"/>
                 <w:szCs w:val="16"/>
@@ -14078,7 +13795,6 @@
           <w:p>
             <w:pPr>
               <w:pStyle w:val="TableParagraph"/>
-              <w:ind w:left="31"/>
               <w:rPr>
                 <w:sz w:val="16"/>
                 <w:szCs w:val="16"/>
@@ -14113,7 +13829,6 @@
           <w:p>
             <w:pPr>
               <w:pStyle w:val="TableParagraph"/>
-              <w:ind w:left="56" w:right="49"/>
               <w:rPr>
                 <w:sz w:val="16"/>
                 <w:szCs w:val="16"/>
@@ -14203,7 +13918,6 @@
           <w:p>
             <w:pPr>
               <w:pStyle w:val="TableParagraph"/>
-              <w:ind w:left="31"/>
               <w:rPr>
                 <w:sz w:val="16"/>
                 <w:szCs w:val="16"/>
@@ -14223,7 +13937,6 @@
           <w:p>
             <w:pPr>
               <w:pStyle w:val="TableParagraph"/>
-              <w:ind w:left="56" w:right="49"/>
               <w:rPr>
                 <w:sz w:val="16"/>
                 <w:szCs w:val="16"/>
@@ -14246,7 +13959,6 @@
           <w:p>
             <w:pPr>
               <w:pStyle w:val="TableParagraph"/>
-              <w:ind w:left="3839" w:right="3810"/>
               <w:jc w:val="center"/>
               <w:rPr>
                 <w:sz w:val="16"/>
@@ -14311,7 +14023,6 @@
           <w:p>
             <w:pPr>
               <w:pStyle w:val="TableParagraph"/>
-              <w:ind w:left="31"/>
               <w:rPr>
                 <w:sz w:val="16"/>
                 <w:szCs w:val="16"/>
@@ -14337,7 +14048,6 @@
           <w:p>
             <w:pPr>
               <w:pStyle w:val="TableParagraph"/>
-              <w:ind w:left="58" w:right="70"/>
               <w:rPr>
                 <w:sz w:val="16"/>
                 <w:szCs w:val="16"/>
@@ -14410,7 +14120,6 @@
           <w:p>
             <w:pPr>
               <w:pStyle w:val="TableParagraph"/>
-              <w:ind w:left="31"/>
               <w:rPr>
                 <w:sz w:val="16"/>
                 <w:szCs w:val="16"/>
@@ -14435,7 +14144,6 @@
           <w:p>
             <w:pPr>
               <w:pStyle w:val="TableParagraph"/>
-              <w:ind w:left="58" w:right="70"/>
               <w:rPr>
                 <w:sz w:val="16"/>
                 <w:szCs w:val="16"/>
@@ -14527,7 +14235,6 @@
           <w:p>
             <w:pPr>
               <w:pStyle w:val="TableParagraph"/>
-              <w:ind w:left="31"/>
               <w:rPr>
                 <w:sz w:val="16"/>
                 <w:szCs w:val="16"/>
@@ -14553,7 +14260,6 @@
           <w:p>
             <w:pPr>
               <w:pStyle w:val="TableParagraph"/>
-              <w:ind w:left="58" w:right="70"/>
               <w:rPr>
                 <w:sz w:val="16"/>
                 <w:szCs w:val="16"/>
@@ -14570,7 +14276,6 @@
           <w:p>
             <w:pPr>
               <w:pStyle w:val="TableParagraph"/>
-              <w:ind w:left="31"/>
               <w:rPr>
                 <w:sz w:val="16"/>
                 <w:szCs w:val="16"/>
@@ -14595,7 +14300,6 @@
           <w:p>
             <w:pPr>
               <w:pStyle w:val="TableParagraph"/>
-              <w:ind w:left="58" w:right="70"/>
               <w:rPr>
                 <w:sz w:val="16"/>
                 <w:szCs w:val="16"/>
@@ -14687,7 +14391,6 @@
           <w:p>
             <w:pPr>
               <w:pStyle w:val="TableParagraph"/>
-              <w:ind w:left="31"/>
               <w:rPr>
                 <w:sz w:val="16"/>
                 <w:szCs w:val="16"/>
@@ -14713,7 +14416,6 @@
           <w:p>
             <w:pPr>
               <w:pStyle w:val="TableParagraph"/>
-              <w:ind w:left="58" w:right="70"/>
               <w:rPr>
                 <w:sz w:val="16"/>
                 <w:szCs w:val="16"/>
@@ -14800,7 +14502,6 @@
           <w:p>
             <w:pPr>
               <w:pStyle w:val="TableParagraph"/>
-              <w:ind w:left="31"/>
               <w:rPr>
                 <w:sz w:val="16"/>
                 <w:szCs w:val="16"/>
@@ -14842,7 +14543,6 @@
           <w:p>
             <w:pPr>
               <w:pStyle w:val="TableParagraph"/>
-              <w:ind w:left="58" w:right="70"/>
               <w:rPr>
                 <w:sz w:val="16"/>
                 <w:szCs w:val="16"/>
@@ -14949,7 +14649,6 @@
           <w:p>
             <w:pPr>
               <w:pStyle w:val="TableParagraph"/>
-              <w:ind w:left="161" w:right="134"/>
               <w:rPr>
                 <w:sz w:val="16"/>
                 <w:szCs w:val="16"/>
@@ -14975,7 +14674,6 @@
           <w:p>
             <w:pPr>
               <w:pStyle w:val="TableParagraph"/>
-              <w:ind w:right="72"/>
               <w:jc w:val="center"/>
               <w:rPr>
                 <w:sz w:val="16"/>
@@ -15018,7 +14716,6 @@
           <w:p>
             <w:pPr>
               <w:pStyle w:val="TableParagraph"/>
-              <w:ind w:right="72"/>
               <w:jc w:val="center"/>
               <w:rPr>
                 <w:sz w:val="16"/>
@@ -15062,7 +14759,6 @@
           <w:p>
             <w:pPr>
               <w:pStyle w:val="TableParagraph"/>
-              <w:ind w:left="82" w:right="72"/>
               <w:jc w:val="center"/>
               <w:rPr>
                 <w:sz w:val="16"/>
@@ -15090,7 +14786,6 @@
           <w:p>
             <w:pPr>
               <w:pStyle w:val="TableParagraph"/>
-              <w:ind w:left="33" w:right="72"/>
               <w:jc w:val="center"/>
               <w:rPr>
                 <w:sz w:val="16"/>
@@ -15110,7 +14805,6 @@
           <w:p>
             <w:pPr>
               <w:pStyle w:val="TableParagraph"/>
-              <w:ind w:left="31" w:right="72"/>
               <w:jc w:val="center"/>
               <w:rPr>
                 <w:sz w:val="16"/>
@@ -15185,7 +14879,6 @@
           <w:p>
             <w:pPr>
               <w:pStyle w:val="TableParagraph"/>
-              <w:ind w:left="90" w:right="122"/>
               <w:rPr>
                 <w:sz w:val="16"/>
                 <w:szCs w:val="16"/>
@@ -15204,7 +14897,6 @@
           <w:p>
             <w:pPr>
               <w:pStyle w:val="TableParagraph"/>
-              <w:ind w:left="90" w:right="122"/>
               <w:rPr>
                 <w:sz w:val="16"/>
                 <w:szCs w:val="16"/>
@@ -15237,7 +14929,6 @@
           <w:p>
             <w:pPr>
               <w:pStyle w:val="TableParagraph"/>
-              <w:ind w:right="72"/>
               <w:jc w:val="center"/>
               <w:rPr>
                 <w:sz w:val="16"/>
@@ -15311,7 +15002,6 @@
           <w:p>
             <w:pPr>
               <w:pStyle w:val="TableParagraph"/>
-              <w:ind w:right="72"/>
               <w:jc w:val="center"/>
               <w:rPr>
                 <w:sz w:val="16"/>
@@ -15338,7 +15028,6 @@
           <w:p>
             <w:pPr>
               <w:pStyle w:val="TableParagraph"/>
-              <w:ind w:left="96" w:right="75"/>
               <w:jc w:val="center"/>
               <w:rPr>
                 <w:sz w:val="16"/>
@@ -15413,7 +15102,6 @@
           <w:p>
             <w:pPr>
               <w:pStyle w:val="TableParagraph"/>
-              <w:ind w:right="72"/>
               <w:jc w:val="center"/>
               <w:rPr>
                 <w:sz w:val="16"/>
@@ -15493,7 +15181,6 @@
           <w:p>
             <w:pPr>
               <w:pStyle w:val="TableParagraph"/>
-              <w:ind w:left="90" w:right="122"/>
               <w:rPr>
                 <w:sz w:val="16"/>
                 <w:szCs w:val="16"/>
@@ -15518,7 +15205,6 @@
           <w:p>
             <w:pPr>
               <w:pStyle w:val="TableParagraph"/>
-              <w:ind w:right="72"/>
               <w:jc w:val="center"/>
               <w:rPr>
                 <w:sz w:val="16"/>
@@ -15592,7 +15278,6 @@
           <w:p>
             <w:pPr>
               <w:pStyle w:val="TableParagraph"/>
-              <w:ind w:right="72"/>
               <w:jc w:val="center"/>
               <w:rPr>
                 <w:sz w:val="16"/>
@@ -15619,7 +15304,6 @@
           <w:p>
             <w:pPr>
               <w:pStyle w:val="TableParagraph"/>
-              <w:ind w:left="96" w:right="75"/>
               <w:jc w:val="center"/>
               <w:rPr>
                 <w:sz w:val="16"/>
@@ -15694,7 +15378,6 @@
           <w:p>
             <w:pPr>
               <w:pStyle w:val="TableParagraph"/>
-              <w:ind w:right="72"/>
               <w:jc w:val="center"/>
               <w:rPr>
                 <w:sz w:val="16"/>
@@ -15774,7 +15457,6 @@
           <w:p>
             <w:pPr>
               <w:pStyle w:val="TableParagraph"/>
-              <w:ind w:left="90" w:right="122"/>
               <w:rPr>
                 <w:sz w:val="16"/>
                 <w:szCs w:val="16"/>
@@ -15793,7 +15475,6 @@
           <w:p>
             <w:pPr>
               <w:pStyle w:val="TableParagraph"/>
-              <w:ind w:left="90" w:right="122"/>
               <w:rPr>
                 <w:sz w:val="16"/>
                 <w:szCs w:val="16"/>
@@ -15818,7 +15499,6 @@
           <w:p>
             <w:pPr>
               <w:pStyle w:val="TableParagraph"/>
-              <w:ind w:right="72"/>
               <w:jc w:val="center"/>
               <w:rPr>
                 <w:sz w:val="16"/>
@@ -15892,7 +15572,6 @@
           <w:p>
             <w:pPr>
               <w:pStyle w:val="TableParagraph"/>
-              <w:ind w:right="72"/>
               <w:jc w:val="center"/>
               <w:rPr>
                 <w:sz w:val="16"/>
@@ -15919,7 +15598,6 @@
           <w:p>
             <w:pPr>
               <w:pStyle w:val="TableParagraph"/>
-              <w:ind w:left="96" w:right="75"/>
               <w:jc w:val="center"/>
               <w:rPr>
                 <w:sz w:val="16"/>
@@ -16011,7 +15689,6 @@
           <w:p>
             <w:pPr>
               <w:pStyle w:val="TableParagraph"/>
-              <w:ind w:right="72"/>
               <w:jc w:val="center"/>
               <w:rPr>
                 <w:sz w:val="16"/>
@@ -16093,7 +15770,6 @@
           <w:p>
             <w:pPr>
               <w:pStyle w:val="TableParagraph"/>
-              <w:ind w:left="90" w:right="122"/>
               <w:rPr>
                 <w:sz w:val="16"/>
                 <w:szCs w:val="16"/>
@@ -16151,7 +15827,6 @@
           <w:p>
             <w:pPr>
               <w:pStyle w:val="TableParagraph"/>
-              <w:ind w:right="72"/>
               <w:jc w:val="center"/>
               <w:rPr>
                 <w:sz w:val="16"/>
@@ -16243,7 +15918,6 @@
           <w:p>
             <w:pPr>
               <w:pStyle w:val="TableParagraph"/>
-              <w:ind w:left="90" w:right="122"/>
               <w:rPr>
                 <w:sz w:val="16"/>
                 <w:szCs w:val="16"/>
@@ -16261,7 +15935,6 @@
           <w:p>
             <w:pPr>
               <w:pStyle w:val="TableParagraph"/>
-              <w:ind w:right="72"/>
               <w:jc w:val="center"/>
               <w:rPr>
                 <w:sz w:val="16"/>
@@ -16372,7 +16045,6 @@
           <w:p>
             <w:pPr>
               <w:pStyle w:val="TableParagraph"/>
-              <w:ind w:left="90" w:right="122"/>
               <w:rPr>
                 <w:sz w:val="16"/>
                 <w:szCs w:val="16"/>
@@ -16415,7 +16087,6 @@
           <w:p>
             <w:pPr>
               <w:pStyle w:val="TableParagraph"/>
-              <w:ind w:right="72"/>
               <w:jc w:val="center"/>
               <w:rPr>
                 <w:sz w:val="16"/>
@@ -16443,7 +16114,6 @@
           <w:p>
             <w:pPr>
               <w:pStyle w:val="TableParagraph"/>
-              <w:ind w:right="72"/>
               <w:jc w:val="center"/>
               <w:rPr>
                 <w:sz w:val="16"/>
@@ -16492,7 +16162,6 @@
           <w:p>
             <w:pPr>
               <w:pStyle w:val="TableParagraph"/>
-              <w:ind w:left="90" w:right="122"/>
               <w:rPr>
                 <w:sz w:val="16"/>
                 <w:szCs w:val="16"/>
@@ -16510,7 +16179,6 @@
           <w:p>
             <w:pPr>
               <w:pStyle w:val="TableParagraph"/>
-              <w:ind w:right="72"/>
               <w:jc w:val="center"/>
               <w:rPr>
                 <w:sz w:val="16"/>
@@ -16537,7 +16205,6 @@
           <w:p>
             <w:pPr>
               <w:pStyle w:val="TableParagraph"/>
-              <w:ind w:right="72"/>
               <w:jc w:val="center"/>
               <w:rPr>
                 <w:sz w:val="16"/>
@@ -16563,7 +16230,6 @@
           <w:p>
             <w:pPr>
               <w:pStyle w:val="TableParagraph"/>
-              <w:ind w:right="72"/>
               <w:jc w:val="center"/>
               <w:rPr>
                 <w:sz w:val="16"/>
@@ -16759,7 +16425,6 @@
           <w:p>
             <w:pPr>
               <w:pStyle w:val="TableParagraph"/>
-              <w:ind w:left="90" w:right="122"/>
               <w:rPr>
                 <w:sz w:val="16"/>
                 <w:szCs w:val="16"/>
@@ -16777,7 +16442,6 @@
           <w:p>
             <w:pPr>
               <w:pStyle w:val="TableParagraph"/>
-              <w:ind w:right="72"/>
               <w:jc w:val="center"/>
               <w:rPr>
                 <w:sz w:val="16"/>
@@ -16804,7 +16468,6 @@
           <w:p>
             <w:pPr>
               <w:pStyle w:val="TableParagraph"/>
-              <w:ind w:right="72"/>
               <w:jc w:val="center"/>
               <w:rPr>
                 <w:sz w:val="16"/>
@@ -16830,7 +16493,6 @@
           <w:p>
             <w:pPr>
               <w:pStyle w:val="TableParagraph"/>
-              <w:ind w:right="72"/>
               <w:jc w:val="center"/>
               <w:rPr>
                 <w:sz w:val="16"/>
@@ -17040,7 +16702,6 @@
           <w:p>
             <w:pPr>
               <w:pStyle w:val="TableParagraph"/>
-              <w:ind w:left="90" w:right="122"/>
               <w:rPr>
                 <w:sz w:val="16"/>
                 <w:szCs w:val="16"/>
@@ -17058,7 +16719,6 @@
           <w:p>
             <w:pPr>
               <w:pStyle w:val="TableParagraph"/>
-              <w:ind w:right="72"/>
               <w:jc w:val="center"/>
               <w:rPr>
                 <w:sz w:val="16"/>
@@ -17085,7 +16745,6 @@
           <w:p>
             <w:pPr>
               <w:pStyle w:val="TableParagraph"/>
-              <w:ind w:right="72"/>
               <w:jc w:val="center"/>
               <w:rPr>
                 <w:sz w:val="16"/>
@@ -17111,7 +16770,6 @@
           <w:p>
             <w:pPr>
               <w:pStyle w:val="TableParagraph"/>
-              <w:ind w:right="72"/>
               <w:jc w:val="center"/>
               <w:rPr>
                 <w:sz w:val="16"/>
@@ -17373,7 +17031,6 @@
           <w:p>
             <w:pPr>
               <w:pStyle w:val="TableParagraph"/>
-              <w:ind w:left="22" w:right="141"/>
               <w:jc w:val="center"/>
               <w:rPr>
                 <w:sz w:val="16"/>
@@ -17400,7 +17057,6 @@
           <w:p>
             <w:pPr>
               <w:pStyle w:val="TableParagraph"/>
-              <w:ind w:left="97" w:right="23"/>
               <w:jc w:val="center"/>
               <w:rPr>
                 <w:sz w:val="16"/>
@@ -17426,7 +17082,6 @@
           <w:p>
             <w:pPr>
               <w:pStyle w:val="TableParagraph"/>
-              <w:ind w:left="97" w:right="23"/>
               <w:jc w:val="center"/>
               <w:rPr>
                 <w:sz w:val="16"/>
@@ -17476,7 +17131,6 @@
           <w:p>
             <w:pPr>
               <w:pStyle w:val="TableParagraph"/>
-              <w:ind w:left="97" w:right="23"/>
               <w:jc w:val="center"/>
               <w:rPr>
                 <w:sz w:val="16"/>
@@ -17518,7 +17172,6 @@
           <w:p>
             <w:pPr>
               <w:pStyle w:val="TableParagraph"/>
-              <w:ind w:left="97" w:right="23"/>
               <w:jc w:val="center"/>
               <w:rPr>
                 <w:sz w:val="16"/>
@@ -17544,7 +17197,6 @@
           <w:p>
             <w:pPr>
               <w:pStyle w:val="TableParagraph"/>
-              <w:ind w:left="97" w:right="23"/>
               <w:jc w:val="center"/>
               <w:rPr>
                 <w:sz w:val="16"/>
@@ -17570,7 +17222,6 @@
           <w:p>
             <w:pPr>
               <w:pStyle w:val="TableParagraph"/>
-              <w:ind w:left="97" w:right="23"/>
               <w:jc w:val="center"/>
               <w:rPr>
                 <w:sz w:val="16"/>
@@ -17596,7 +17247,6 @@
           <w:p>
             <w:pPr>
               <w:pStyle w:val="TableParagraph"/>
-              <w:ind w:left="97" w:right="23"/>
               <w:jc w:val="center"/>
               <w:rPr>
                 <w:sz w:val="16"/>
@@ -17622,7 +17272,6 @@
           <w:p>
             <w:pPr>
               <w:pStyle w:val="TableParagraph"/>
-              <w:ind w:left="97" w:right="23"/>
               <w:jc w:val="center"/>
               <w:rPr>
                 <w:sz w:val="16"/>
@@ -19606,7 +19255,6 @@
           <w:p>
             <w:pPr>
               <w:pStyle w:val="TableParagraph"/>
-              <w:ind w:left="30" w:right="85"/>
               <w:jc w:val="right"/>
               <w:rPr>
                 <w:sz w:val="16"/>
@@ -19632,7 +19280,6 @@
           <w:p>
             <w:pPr>
               <w:pStyle w:val="TableParagraph"/>
-              <w:ind w:left="97" w:right="23"/>
               <w:jc w:val="center"/>
               <w:rPr>
                 <w:sz w:val="16"/>
@@ -19650,7 +19297,6 @@
           <w:p>
             <w:pPr>
               <w:pStyle w:val="TableParagraph"/>
-              <w:ind w:left="97" w:right="23"/>
               <w:jc w:val="center"/>
               <w:rPr>
                 <w:sz w:val="16"/>
@@ -19668,7 +19314,6 @@
           <w:p>
             <w:pPr>
               <w:pStyle w:val="TableParagraph"/>
-              <w:ind w:left="97" w:right="23"/>
               <w:jc w:val="center"/>
               <w:rPr>
                 <w:sz w:val="16"/>
@@ -19686,7 +19331,6 @@
           <w:p>
             <w:pPr>
               <w:pStyle w:val="TableParagraph"/>
-              <w:ind w:left="97" w:right="23"/>
               <w:jc w:val="center"/>
               <w:rPr>
                 <w:sz w:val="16"/>
@@ -19704,7 +19348,6 @@
           <w:p>
             <w:pPr>
               <w:pStyle w:val="TableParagraph"/>
-              <w:ind w:left="97" w:right="23"/>
               <w:jc w:val="center"/>
               <w:rPr>
                 <w:sz w:val="16"/>
@@ -19758,7 +19401,6 @@
           <w:p>
             <w:pPr>
               <w:pStyle w:val="TableParagraph"/>
-              <w:ind w:left="97" w:right="23"/>
               <w:jc w:val="center"/>
               <w:rPr>
                 <w:sz w:val="16"/>
@@ -19804,7 +19446,6 @@
           <w:p>
             <w:pPr>
               <w:pStyle w:val="TableParagraph"/>
-              <w:ind w:left="97" w:right="23"/>
               <w:jc w:val="center"/>
               <w:rPr>
                 <w:sz w:val="16"/>
@@ -19850,7 +19491,6 @@
           <w:p>
             <w:pPr>
               <w:pStyle w:val="TableParagraph"/>
-              <w:ind w:left="97" w:right="23"/>
               <w:jc w:val="center"/>
               <w:rPr>
                 <w:sz w:val="16"/>
@@ -19949,7 +19589,6 @@
           <w:p>
             <w:pPr>
               <w:pStyle w:val="TableParagraph"/>
-              <w:ind w:left="30"/>
               <w:rPr>
                 <w:sz w:val="16"/>
                 <w:szCs w:val="16"/>
@@ -19975,7 +19614,6 @@
           <w:p>
             <w:pPr>
               <w:pStyle w:val="TableParagraph"/>
-              <w:ind w:left="71"/>
               <w:rPr>
                 <w:sz w:val="16"/>
                 <w:szCs w:val="16"/>
@@ -20026,7 +19664,6 @@
           <w:p>
             <w:pPr>
               <w:pStyle w:val="TableParagraph"/>
-              <w:ind w:left="30"/>
               <w:rPr>
                 <w:sz w:val="16"/>
                 <w:szCs w:val="16"/>
@@ -20051,7 +19688,6 @@
           <w:p>
             <w:pPr>
               <w:pStyle w:val="TableParagraph"/>
-              <w:ind w:left="71"/>
               <w:rPr>
                 <w:sz w:val="16"/>
                 <w:szCs w:val="16"/>
@@ -20101,7 +19737,6 @@
           <w:p>
             <w:pPr>
               <w:pStyle w:val="TableParagraph"/>
-              <w:ind w:left="71"/>
               <w:rPr>
                 <w:sz w:val="16"/>
                 <w:szCs w:val="16"/>
@@ -20155,7 +19790,6 @@
           <w:p>
             <w:pPr>
               <w:pStyle w:val="TableParagraph"/>
-              <w:ind w:left="71"/>
               <w:rPr>
                 <w:sz w:val="16"/>
                 <w:szCs w:val="16"/>
@@ -20212,7 +19846,6 @@
           <w:p>
             <w:pPr>
               <w:pStyle w:val="TableParagraph"/>
-              <w:ind w:left="882" w:right="858"/>
               <w:jc w:val="center"/>
               <w:rPr>
                 <w:sz w:val="16"/>
@@ -20271,7 +19904,6 @@
           <w:p>
             <w:pPr>
               <w:pStyle w:val="TableParagraph"/>
-              <w:ind w:left="776"/>
               <w:rPr>
                 <w:sz w:val="16"/>
                 <w:szCs w:val="16"/>
@@ -20304,7 +19936,6 @@
           <w:p>
             <w:pPr>
               <w:pStyle w:val="TableParagraph"/>
-              <w:ind w:left="882" w:right="852"/>
               <w:jc w:val="center"/>
               <w:rPr>
                 <w:sz w:val="16"/>

</xml_diff>